<commit_message>
feat(dgt): asignar zonas y firmantes en SignRequest
</commit_message>
<xml_diff>
--- a/plantillas/tramites_dgt/dgt_contrato_compraventa.docx
+++ b/plantillas/tramites_dgt/dgt_contrato_compraventa.docx
@@ -892,6 +892,18 @@
               <w:t>{{ vendedor_firma }}</w:t>
             </w:r>
           </w:p>
+          <w:p>
+            <w:pPr>
+              <w:jc w:val="center"/>
+            </w:pPr>
+            <w:r>
+              <w:rPr>
+                <w:color w:val="FFFFFF"/>
+                <w:sz w:val="36"/>
+              </w:rPr>
+              <w:t>[[s|1                          ]]</w:t>
+            </w:r>
+          </w:p>
         </w:tc>
         <w:tc>
           <w:tcPr>
@@ -907,6 +919,18 @@
           <w:p>
             <w:r>
               <w:t>{{ comprador_firma }}</w:t>
+            </w:r>
+          </w:p>
+          <w:p>
+            <w:pPr>
+              <w:jc w:val="center"/>
+            </w:pPr>
+            <w:r>
+              <w:rPr>
+                <w:color w:val="FFFFFF"/>
+                <w:sz w:val="36"/>
+              </w:rPr>
+              <w:t>[[s|2                          ]]</w:t>
             </w:r>
           </w:p>
         </w:tc>

</xml_diff>